<commit_message>
English literature reviews 1-5 (translated and fidelity-reviewed)
Bayesian UQ for equation learning, non-Bayesian equation learning, priors,
non-classical modelling of complex systems, Koopman and reservoir computing.

Co-Authored-By: Claude Opus 5.5 <noreply@anthropic.com>
Claude-Session: https://claude.ai/code/session_016Cdcj2FTAQGBVsJUyYJR2M
</commit_message>
<xml_diff>
--- a/docs/literature/Literature_review_Bayesian_UQ_Equation_Learning_2020-2026.docx
+++ b/docs/literature/Literature_review_Bayesian_UQ_Equation_Learning_2020-2026.docx
@@ -452,7 +452,7 @@
             <w:vAlign w:val="top"/>
           </w:tcPr>
           <w:p>
-            <w:hyperlink w:history="1" r:id="rIdj_2k9jgcboijibmzv_jyb">
+            <w:hyperlink w:history="1" r:id="rIdenkxs2ftbxmcirmlksu_o">
               <w:r>
                 <w:rPr>
                   <w:color w:val="1D4ED8"/>
@@ -1352,7 +1352,7 @@
         </m:d>
       </m:oMath>
       <w:r>
-        <w:t xml:space="preserve">. The high-noise data average </w:t>
+        <w:t xml:space="preserve">. The high-noise data average over </w:t>
       </w:r>
       <m:oMath>
         <m:r>
@@ -1369,7 +1369,7 @@
         </m:r>
       </m:oMath>
       <w:r>
-        <w:t xml:space="preserve"> ABM realization, while the low-noise data average </w:t>
+        <w:t xml:space="preserve"> ABM realization, while the low-noise data average over </w:t>
       </w:r>
       <m:oMath>
         <m:r>
@@ -4227,7 +4227,7 @@
         <w:jc w:val="both"/>
       </w:pPr>
       <w:r>
-        <w:t xml:space="preserve">The search covers the period January 1, 2020 – October 6, 2026. Only articles in which at least one author, at the time of publication, was affiliated with one of four institutions were accepted: </w:t>
+        <w:t xml:space="preserve">The search covers the period January 1, 2020 – October 6, 2026. Only articles with at least one author affiliated, at the time of publication, with one of the four institutions were accepted: </w:t>
       </w:r>
       <w:r>
         <w:rPr>
@@ -7153,7 +7153,7 @@
             <w:vAlign w:val="top"/>
           </w:tcPr>
           <w:p>
-            <w:hyperlink w:history="1" r:id="rIdnonv_gcjotdwvkdyii8b5">
+            <w:hyperlink w:history="1" r:id="rIdoen3e5com15qte6tnoqqz">
               <w:r>
                 <w:rPr>
                   <w:color w:val="1D4ED8"/>
@@ -7936,7 +7936,7 @@
             <w:vAlign w:val="top"/>
           </w:tcPr>
           <w:p>
-            <w:hyperlink w:history="1" r:id="rIdy351kvrwrxqolw49ptbfn">
+            <w:hyperlink w:history="1" r:id="rIdhi-oapvbhrwij6wvdh8p7">
               <w:r>
                 <w:rPr>
                   <w:color w:val="1D4ED8"/>
@@ -8536,7 +8536,7 @@
         <w:t xml:space="preserve">Link to the base article. </w:t>
       </w:r>
       <w:r>
-        <w:t xml:space="preserve">A direct follow-up by the first and last authors of the base article. It targets the high cost of the ABC step on the same kind of biological system (cells that move and proliferate), but with large-scale real data.</w:t>
+        <w:t xml:space="preserve">A direct follow-up by the first and last authors of the base article. It targets the high cost of the ABC step, on the same kind of biological system (cells that move and proliferate), but with large-scale real data.</w:t>
       </w:r>
     </w:p>
     <w:p>
@@ -8739,7 +8739,7 @@
             <w:vAlign w:val="top"/>
           </w:tcPr>
           <w:p>
-            <w:hyperlink w:history="1" r:id="rIdsm4w3ap4ubx-_g31w4ab-">
+            <w:hyperlink w:history="1" r:id="rIdulsq5olg5myv9rqnmghyj">
               <w:r>
                 <w:rPr>
                   <w:color w:val="1D4ED8"/>
@@ -9704,7 +9704,7 @@
             <w:vAlign w:val="top"/>
           </w:tcPr>
           <w:p>
-            <w:hyperlink w:history="1" r:id="rIdfb8vgmw8yiwjhjcbww9t2">
+            <w:hyperlink w:history="1" r:id="rId-xuppdx9joad89pdxxuj9">
               <w:r>
                 <w:rPr>
                   <w:color w:val="1D4ED8"/>
@@ -10778,7 +10778,7 @@
             <w:vAlign w:val="top"/>
           </w:tcPr>
           <w:p>
-            <w:hyperlink w:history="1" r:id="rIdrpjpcj0bm7ra3-w9mr83j">
+            <w:hyperlink w:history="1" r:id="rIdds_pqaykwghe6btmgkydb">
               <w:r>
                 <w:rPr>
                   <w:color w:val="1D4ED8"/>
@@ -10969,7 +10969,7 @@
         <w:t xml:space="preserve">Summary. </w:t>
       </w:r>
       <w:r>
-        <w:t xml:space="preserve">The article uses the profile likelihood method to study the practical identifiability of the parameters in four extensions of the Fisher–KPP model, fitted to experimental data from a cell invasion assay. It shows that more complex models tend to be less identifiable, more sensitive to experimental details and in need of more data. The authors propose identifiability as a model-selection criterion, alongside fit to the data and complexity.</w:t>
+        <w:t xml:space="preserve">The article uses the profile likelihood method to study the practical identifiability of the parameters in four extensions of the Fisher–KPP model, fitted to experimental data from a cell invasion assay. It shows that more complex models tend to be less identifiable and more sensitive to experimental details, and that they require more data. The authors propose identifiability as a model-selection criterion, alongside fit to the data and complexity.</w:t>
       </w:r>
     </w:p>
     <w:p>
@@ -11916,7 +11916,7 @@
             <w:vAlign w:val="top"/>
           </w:tcPr>
           <w:p>
-            <w:hyperlink w:history="1" r:id="rIdtjhbxnybpotuvfvud3pfw">
+            <w:hyperlink w:history="1" r:id="rId0oxojun7gon5nwue7gk0j">
               <w:r>
                 <w:rPr>
                   <w:color w:val="1D4ED8"/>
@@ -12836,7 +12836,7 @@
             <w:vAlign w:val="top"/>
           </w:tcPr>
           <w:p>
-            <w:hyperlink w:history="1" r:id="rIdcbkeu0am4-qi1paffag91">
+            <w:hyperlink w:history="1" r:id="rIdsgxiv0ansydodhfokm5yo">
               <w:r>
                 <w:rPr>
                   <w:color w:val="1D4ED8"/>
@@ -13869,7 +13869,7 @@
             <w:vAlign w:val="top"/>
           </w:tcPr>
           <w:p>
-            <w:hyperlink w:history="1" r:id="rIdm-aqzmtq9bpdlquayw0bm">
+            <w:hyperlink w:history="1" r:id="rIdkd42bamn7ivjejsbq9c6t">
               <w:r>
                 <w:rPr>
                   <w:color w:val="1D4ED8"/>
@@ -14825,7 +14825,7 @@
             <w:vAlign w:val="top"/>
           </w:tcPr>
           <w:p>
-            <w:hyperlink w:history="1" r:id="rId4vfy7ouwmvjpw-kphcvfv">
+            <w:hyperlink w:history="1" r:id="rIdwjyc1fz1meg_e_bacrsfo">
               <w:r>
                 <w:rPr>
                   <w:color w:val="1D4ED8"/>
@@ -15708,7 +15708,7 @@
             <w:vAlign w:val="top"/>
           </w:tcPr>
           <w:p>
-            <w:hyperlink w:history="1" r:id="rIdvyrktymusnmee51ovg83n">
+            <w:hyperlink w:history="1" r:id="rIdspxbjdp4bmpapq-ssjk11">
               <w:r>
                 <w:rPr>
                   <w:color w:val="1D4ED8"/>
@@ -15899,7 +15899,7 @@
         <w:t xml:space="preserve">Summary. </w:t>
       </w:r>
       <w:r>
-        <w:t xml:space="preserve">The article asks where targeted high-resolution simulations (or measurements) should be performed to best inform the calibration of parameterizations in climate models. It proposes an experimental design algorithm based on ensemble Kalman methods that estimates the information gain at low cost and without derivatives. The most information is found near the intertropical convergence zone, which the algorithm finds automatically.</w:t>
+        <w:t xml:space="preserve">The article asks where targeted high-resolution simulations (or measurements) should be performed to best inform the calibration of parameterizations in climate models. It proposes an experimental design algorithm based on ensemble Kalman methods that estimates the information gain at low cost and without derivatives. The most information comes from near the intertropical convergence zone, which the algorithm locates automatically.</w:t>
       </w:r>
     </w:p>
     <w:p>
@@ -16568,7 +16568,7 @@
             <w:vAlign w:val="top"/>
           </w:tcPr>
           <w:p>
-            <w:hyperlink w:history="1" r:id="rIdql9jmsnlo2emhih_rot2o">
+            <w:hyperlink w:history="1" r:id="rIduoxil295nq5ibwreyqwrx">
               <w:r>
                 <w:rPr>
                   <w:color w:val="1D4ED8"/>
@@ -17943,7 +17943,7 @@
             <w:vAlign w:val="top"/>
           </w:tcPr>
           <w:p>
-            <w:hyperlink w:history="1" r:id="rId-flg8a_txpbb3sbwpi66q">
+            <w:hyperlink w:history="1" r:id="rIdzlnrbhevwktjpagdswlj4">
               <w:r>
                 <w:rPr>
                   <w:color w:val="1D4ED8"/>
@@ -18770,7 +18770,7 @@
             <w:vAlign w:val="top"/>
           </w:tcPr>
           <w:p>
-            <w:hyperlink w:history="1" r:id="rIdsfeynxdfvcgu3ohv6uapn">
+            <w:hyperlink w:history="1" r:id="rIdjlbatz6xsgk6fyglxidvl">
               <w:r>
                 <w:rPr>
                   <w:color w:val="1D4ED8"/>
@@ -19808,7 +19808,7 @@
             <w:vAlign w:val="top"/>
           </w:tcPr>
           <w:p>
-            <w:hyperlink w:history="1" r:id="rId2jru6mlmqd-5kclcqsbph">
+            <w:hyperlink w:history="1" r:id="rIdc6krz51rmeyp1pi-akpbr">
               <w:r>
                 <w:rPr>
                   <w:color w:val="1D4ED8"/>
@@ -20546,7 +20546,7 @@
             <w:vAlign w:val="top"/>
           </w:tcPr>
           <w:p>
-            <w:hyperlink w:history="1" r:id="rIdm3rclzji_hubvn6bhwcwr">
+            <w:hyperlink w:history="1" r:id="rIdqlurkvzkqeekoo5ktvtal">
               <w:r>
                 <w:rPr>
                   <w:color w:val="1D4ED8"/>
@@ -21547,7 +21547,7 @@
             <w:vAlign w:val="top"/>
           </w:tcPr>
           <w:p>
-            <w:hyperlink w:history="1" r:id="rIdujikoskknkkopxzjagqhb">
+            <w:hyperlink w:history="1" r:id="rId_k1bvgloutve0prdtb0_m">
               <w:r>
                 <w:rPr>
                   <w:color w:val="1D4ED8"/>
@@ -22411,7 +22411,7 @@
           <w:sz w:val="19"/>
           <w:szCs w:val="19"/>
         </w:rPr>
-        <w:t xml:space="preserve"> is built from the measured displacements and the derivatives of the terms (weak-form linear momentum balance and reaction-force balance), </w:t>
+        <w:t xml:space="preserve"> is built from the measured displacements and the derivatives of the terms (weak-form momentum balance and reaction-force balance), </w:t>
       </w:r>
       <m:oMath>
         <m:r>
@@ -22787,7 +22787,7 @@
             <w:vAlign w:val="top"/>
           </w:tcPr>
           <w:p>
-            <w:hyperlink w:history="1" r:id="rIdooafsg42zux6olx2b8xl_">
+            <w:hyperlink w:history="1" r:id="rIdzvjt8iowz6lkkfint6h7w">
               <w:r>
                 <w:rPr>
                   <w:color w:val="1D4ED8"/>
@@ -23886,7 +23886,7 @@
             <w:vAlign w:val="top"/>
           </w:tcPr>
           <w:p>
-            <w:hyperlink w:history="1" r:id="rIde8wf8k5goawallshqvpzb">
+            <w:hyperlink w:history="1" r:id="rId-0ssi_p9ubsnr_bq05fe4">
               <w:r>
                 <w:rPr>
                   <w:color w:val="1D4ED8"/>
@@ -24812,7 +24812,7 @@
             <w:vAlign w:val="top"/>
           </w:tcPr>
           <w:p>
-            <w:hyperlink w:history="1" r:id="rIdocdcox_r5xjbh6khfk4ls">
+            <w:hyperlink w:history="1" r:id="rIdlfqtljttclgk6vlxesz14">
               <w:r>
                 <w:rPr>
                   <w:color w:val="1D4ED8"/>
@@ -26000,7 +26000,7 @@
             <w:vAlign w:val="top"/>
           </w:tcPr>
           <w:p>
-            <w:hyperlink w:history="1" r:id="rIdfh4mddklv7j5et63regqd">
+            <w:hyperlink w:history="1" r:id="rId72f1v7lwpfiprie1cmbus">
               <w:r>
                 <w:rPr>
                   <w:color w:val="1D4ED8"/>
@@ -29268,7 +29268,7 @@
               </w:rPr>
               <w:t xml:space="preserve">, 16(12), e1008462. </w:t>
             </w:r>
-            <w:hyperlink w:history="1" r:id="rIdo2zpuyxkdqlxzlfdwkxdb">
+            <w:hyperlink w:history="1" r:id="rIdnwpzv1dzbqgqu-zyo7usg">
               <w:r>
                 <w:rPr>
                   <w:color w:val="1D4ED8"/>
@@ -29450,7 +29450,7 @@
               </w:rPr>
               <w:t xml:space="preserve">, 444, 133583. </w:t>
             </w:r>
-            <w:hyperlink w:history="1" r:id="rId8ufyfiehhinyfnmtpu3dl">
+            <w:hyperlink w:history="1" r:id="rId154cqrugc9znhduf3wbgr">
               <w:r>
                 <w:rPr>
                   <w:color w:val="1D4ED8"/>
@@ -29616,7 +29616,7 @@
               </w:rPr>
               <w:t xml:space="preserve">, 15, 034062. </w:t>
             </w:r>
-            <w:hyperlink w:history="1" r:id="rId8_p66xofv90r8trrdht4o">
+            <w:hyperlink w:history="1" r:id="rIdfxgccvghrgaymo5fszgqx">
               <w:r>
                 <w:rPr>
                   <w:color w:val="1D4ED8"/>
@@ -29713,7 +29713,7 @@
               </w:rPr>
               <w:t xml:space="preserve">, 15, 4911. </w:t>
             </w:r>
-            <w:hyperlink w:history="1" r:id="rIdvd316phaijee_3-pvw3m-">
+            <w:hyperlink w:history="1" r:id="rIdzc0mcb1eqlpukphmmribs">
               <w:r>
                 <w:rPr>
                   <w:color w:val="1D4ED8"/>
@@ -29809,7 +29809,7 @@
               </w:rPr>
               <w:t xml:space="preserve">, 178, 109276. </w:t>
             </w:r>
-            <w:hyperlink w:history="1" r:id="rId3doc71p-txdmjzqafk4ap">
+            <w:hyperlink w:history="1" r:id="rIdgx_qcv_kpawwcfdv-umlz">
               <w:r>
                 <w:rPr>
                   <w:color w:val="1D4ED8"/>
@@ -32398,7 +32398,7 @@
         </w:rPr>
         <w:t xml:space="preserve"> </w:t>
       </w:r>
-      <w:hyperlink w:history="1" r:id="rIdlkzs4dt8wftzito2vtbhg">
+      <w:hyperlink w:history="1" r:id="rId-yffo42f2sjss1fx0ktsm">
         <w:r>
           <w:rPr>
             <w:color w:val="1D4ED8"/>
@@ -32459,7 +32459,7 @@
         </w:rPr>
         <w:t xml:space="preserve"> </w:t>
       </w:r>
-      <w:hyperlink w:history="1" r:id="rId2s32xrswivet71zc9hqvy">
+      <w:hyperlink w:history="1" r:id="rIdvkpeopucs9mbartkmca7q">
         <w:r>
           <w:rPr>
             <w:color w:val="1D4ED8"/>
@@ -32520,7 +32520,7 @@
         </w:rPr>
         <w:t xml:space="preserve"> </w:t>
       </w:r>
-      <w:hyperlink w:history="1" r:id="rIddgtcrmhtdegt2khd_woe_">
+      <w:hyperlink w:history="1" r:id="rIdgbofx6fjqdgyasor1884n">
         <w:r>
           <w:rPr>
             <w:color w:val="1D4ED8"/>
@@ -32581,7 +32581,7 @@
         </w:rPr>
         <w:t xml:space="preserve"> </w:t>
       </w:r>
-      <w:hyperlink w:history="1" r:id="rIdb78zz6oj4lbltd3aqflxl">
+      <w:hyperlink w:history="1" r:id="rIde-dkigyxfx4tt7bhusjno">
         <w:r>
           <w:rPr>
             <w:color w:val="1D4ED8"/>
@@ -32642,7 +32642,7 @@
         </w:rPr>
         <w:t xml:space="preserve"> </w:t>
       </w:r>
-      <w:hyperlink w:history="1" r:id="rIdgga0gp5nswa2bd1mwba8j">
+      <w:hyperlink w:history="1" r:id="rIdmzgzqqp-s4tbavbr9lty2">
         <w:r>
           <w:rPr>
             <w:color w:val="1D4ED8"/>
@@ -32703,7 +32703,7 @@
         </w:rPr>
         <w:t xml:space="preserve"> </w:t>
       </w:r>
-      <w:hyperlink w:history="1" r:id="rIdryjqzl7vdgzoy7rpg02ok">
+      <w:hyperlink w:history="1" r:id="rIdclxr0wockwtvwuvflvi0n">
         <w:r>
           <w:rPr>
             <w:color w:val="1D4ED8"/>
@@ -32764,7 +32764,7 @@
         </w:rPr>
         <w:t xml:space="preserve"> </w:t>
       </w:r>
-      <w:hyperlink w:history="1" r:id="rIdfpq4z8l27awu3orlaum3h">
+      <w:hyperlink w:history="1" r:id="rIdyu0odlt1lv6tnhptg9_8b">
         <w:r>
           <w:rPr>
             <w:color w:val="1D4ED8"/>
@@ -32825,7 +32825,7 @@
         </w:rPr>
         <w:t xml:space="preserve"> </w:t>
       </w:r>
-      <w:hyperlink w:history="1" r:id="rIdzuaun3cl2h3afm6mfvzn7">
+      <w:hyperlink w:history="1" r:id="rIdxekgwlpjyjvj79rjomjro">
         <w:r>
           <w:rPr>
             <w:color w:val="1D4ED8"/>
@@ -32886,7 +32886,7 @@
         </w:rPr>
         <w:t xml:space="preserve"> </w:t>
       </w:r>
-      <w:hyperlink w:history="1" r:id="rIdk0_1ulpvh0ugi6wzpxwfx">
+      <w:hyperlink w:history="1" r:id="rIdhczfr_6v_jvm2fioffml6">
         <w:r>
           <w:rPr>
             <w:color w:val="1D4ED8"/>
@@ -32947,7 +32947,7 @@
         </w:rPr>
         <w:t xml:space="preserve"> </w:t>
       </w:r>
-      <w:hyperlink w:history="1" r:id="rId3njomk93ldmt9nlp4zroj">
+      <w:hyperlink w:history="1" r:id="rIddcjben90bcsjpcff6ynnr">
         <w:r>
           <w:rPr>
             <w:color w:val="1D4ED8"/>
@@ -33008,7 +33008,7 @@
         </w:rPr>
         <w:t xml:space="preserve"> </w:t>
       </w:r>
-      <w:hyperlink w:history="1" r:id="rIda4cidn12hmegvuh9gyoku">
+      <w:hyperlink w:history="1" r:id="rId2bpxgc-zoixkun82mqd6w">
         <w:r>
           <w:rPr>
             <w:color w:val="1D4ED8"/>
@@ -33069,7 +33069,7 @@
         </w:rPr>
         <w:t xml:space="preserve"> </w:t>
       </w:r>
-      <w:hyperlink w:history="1" r:id="rIde4envon4jbbgcrahzeuzv">
+      <w:hyperlink w:history="1" r:id="rIdp55swyljdbqzfzqo14duo">
         <w:r>
           <w:rPr>
             <w:color w:val="1D4ED8"/>
@@ -33130,7 +33130,7 @@
         </w:rPr>
         <w:t xml:space="preserve"> </w:t>
       </w:r>
-      <w:hyperlink w:history="1" r:id="rIdskd0u7oooar3tgra_oaoj">
+      <w:hyperlink w:history="1" r:id="rIdiule-7zaw44cklpy02ml3">
         <w:r>
           <w:rPr>
             <w:color w:val="1D4ED8"/>
@@ -33191,7 +33191,7 @@
         </w:rPr>
         <w:t xml:space="preserve"> </w:t>
       </w:r>
-      <w:hyperlink w:history="1" r:id="rIdb6vpzrvkzmjplc--qobha">
+      <w:hyperlink w:history="1" r:id="rId6pvz4bathkvxc7wv2mqhk">
         <w:r>
           <w:rPr>
             <w:color w:val="1D4ED8"/>
@@ -33252,7 +33252,7 @@
         </w:rPr>
         <w:t xml:space="preserve"> </w:t>
       </w:r>
-      <w:hyperlink w:history="1" r:id="rIda-1f4gggojz0tazkrgy0q">
+      <w:hyperlink w:history="1" r:id="rId5xhbamak9v-av6yizxo0r">
         <w:r>
           <w:rPr>
             <w:color w:val="1D4ED8"/>
@@ -33313,7 +33313,7 @@
         </w:rPr>
         <w:t xml:space="preserve"> </w:t>
       </w:r>
-      <w:hyperlink w:history="1" r:id="rIdsyvhix92lo3rocrfqfxfk">
+      <w:hyperlink w:history="1" r:id="rIdy8cqcs1zmo_tsnm0trqwu">
         <w:r>
           <w:rPr>
             <w:color w:val="1D4ED8"/>
@@ -33374,7 +33374,7 @@
         </w:rPr>
         <w:t xml:space="preserve"> </w:t>
       </w:r>
-      <w:hyperlink w:history="1" r:id="rIdwjbzbfheuyawfbh2hxypy">
+      <w:hyperlink w:history="1" r:id="rIdua3rfsqzvvrc6njouayhd">
         <w:r>
           <w:rPr>
             <w:color w:val="1D4ED8"/>
@@ -33435,7 +33435,7 @@
         </w:rPr>
         <w:t xml:space="preserve"> </w:t>
       </w:r>
-      <w:hyperlink w:history="1" r:id="rIdgwbqx8gq63hbcyrcv51j9">
+      <w:hyperlink w:history="1" r:id="rIdujfhtyjixkct9paug3fnj">
         <w:r>
           <w:rPr>
             <w:color w:val="1D4ED8"/>
@@ -33496,7 +33496,7 @@
         </w:rPr>
         <w:t xml:space="preserve"> </w:t>
       </w:r>
-      <w:hyperlink w:history="1" r:id="rId2tymweopawd1--jd6831x">
+      <w:hyperlink w:history="1" r:id="rIdumt4yt99dotfi3ufyh-qt">
         <w:r>
           <w:rPr>
             <w:color w:val="1D4ED8"/>
@@ -33557,7 +33557,7 @@
         </w:rPr>
         <w:t xml:space="preserve"> </w:t>
       </w:r>
-      <w:hyperlink w:history="1" r:id="rIdu4qbngatujtdgfwcdzz0o">
+      <w:hyperlink w:history="1" r:id="rIdb9oc6ut9uyvnhbfub9oxl">
         <w:r>
           <w:rPr>
             <w:color w:val="1D4ED8"/>
@@ -33618,7 +33618,7 @@
         </w:rPr>
         <w:t xml:space="preserve"> </w:t>
       </w:r>
-      <w:hyperlink w:history="1" r:id="rIdire93fgc8qzmyz0bf-5uz">
+      <w:hyperlink w:history="1" r:id="rIdad5qtw5ggci4uiwiupzvi">
         <w:r>
           <w:rPr>
             <w:color w:val="1D4ED8"/>

</xml_diff>